<commit_message>
vpscreen-rerank: vpscreen-rerank: pass 4 open; 14 new analysis entries (STLTECH, MOIL, technicals refreshes); Confluence-100 rebuilt (77/100 investable), 1M tactical 6 names, Rs 1L allocation refreshed 5 holdings, master scores + max-returns + expectation-gap regenerated
Co-Authored-By: Claude Sonnet 5 <noreply@anthropic.com>
</commit_message>
<xml_diff>
--- a/projects/valuepickr-open-screen/docs/3B Blackbio DX.docx
+++ b/projects/valuepickr-open-screen/docs/3B Blackbio DX.docx
@@ -3192,6 +3192,171 @@
           <w:szCs w:val="18"/>
         </w:rPr>
         <w:t xml:space="preserve">This is independent research and analysis for informational purposes only, not personalized financial or investment advice. Past multi-bagger performance and forum/social sentiment are not indicators of future returns. Do your own due diligence before investing.</w:t>
+      </w:r>
+    </w:p>
+    <w:p/>
+    <w:p>
+      <w:r>
+        <w:rPr>
+          <w:b/>
+          <w:sz w:val="28"/>
+        </w:rPr>
+        <w:t>🔄 RESEARCH UPDATE - 2026-10-05</w:t>
+      </w:r>
+    </w:p>
+    <w:p>
+      <w:r>
+        <w:rPr>
+          <w:b/>
+        </w:rPr>
+        <w:t>📊 Key Metrics:</w:t>
+      </w:r>
+    </w:p>
+    <w:p>
+      <w:pPr>
+        <w:ind w:left="360"/>
+      </w:pPr>
+      <w:r>
+        <w:t xml:space="preserve">  • Company: 3B Blackbio DX Ltd</w:t>
+      </w:r>
+    </w:p>
+    <w:p>
+      <w:pPr>
+        <w:ind w:left="360"/>
+      </w:pPr>
+      <w:r>
+        <w:t xml:space="preserve">  • Conviction: Medium</w:t>
+      </w:r>
+    </w:p>
+    <w:p>
+      <w:pPr>
+        <w:ind w:left="360"/>
+      </w:pPr>
+      <w:r>
+        <w:t xml:space="preserve">  • Thesis: 100x-in-10-years</w:t>
+      </w:r>
+    </w:p>
+    <w:p>
+      <w:pPr>
+        <w:ind w:left="360"/>
+      </w:pPr>
+      <w:r>
+        <w:t xml:space="preserve">  • 4-Box Score: 3.0</w:t>
+      </w:r>
+    </w:p>
+    <w:p>
+      <w:pPr>
+        <w:ind w:left="360"/>
+      </w:pPr>
+      <w:r>
+        <w:t xml:space="preserve">  • Research Date: 2026-08-31</w:t>
+      </w:r>
+    </w:p>
+    <w:p>
+      <w:pPr>
+        <w:ind w:left="360"/>
+      </w:pPr>
+      <w:r>
+        <w:t xml:space="preserve">  • Red Flag: None</w:t>
+      </w:r>
+    </w:p>
+    <w:p/>
+    <w:p>
+      <w:r>
+        <w:rPr>
+          <w:b/>
+        </w:rPr>
+        <w:t>📝 Verdict:</w:t>
+      </w:r>
+    </w:p>
+    <w:p>
+      <w:pPr>
+        <w:ind w:left="360"/>
+      </w:pPr>
+      <w:r>
+        <w:t>High-quality niche compounder with real long-runway optionality, but the near-term inflection isn't there -- organic growth has slowed to mid-teens and Coris drags FY27; Medium, not Medium-High</w:t>
+      </w:r>
+    </w:p>
+    <w:p/>
+    <w:p>
+      <w:r>
+        <w:rPr>
+          <w:b/>
+        </w:rPr>
+        <w:t>📈 Bull Case:</w:t>
+      </w:r>
+    </w:p>
+    <w:p>
+      <w:pPr>
+        <w:ind w:left="360"/>
+      </w:pPr>
+      <w:r>
+        <w:t>Organic core economics are outstanding: ~78% MDx EBITDA margin, ~25% ROCE, ~19.8% ROE, effectively debt-free, CFO/PAT ~0.87 -- an IP-heavy assay portfolio (120+ assays) on a reagent-rental razor/blade model with 15+ long-term (2-3yr) contracts</w:t>
+      </w:r>
+    </w:p>
+    <w:p>
+      <w:pPr>
+        <w:ind w:left="360"/>
+      </w:pPr>
+      <w:r>
+        <w:t>Small base (~Rs 1,245 Cr market cap) vs an ~10x-larger unlisted leader (Molbio); molecular diagnostics adoption in India is structurally growing and 3B runs higher margins than Molbio</w:t>
+      </w:r>
+    </w:p>
+    <w:p>
+      <w:pPr>
+        <w:ind w:left="360"/>
+      </w:pPr>
+      <w:r>
+        <w:t>Genuine multi-year optionality: US FDA registration for Coris's RESIST-5 AMR panel (US market 2027-28), IVDR certification progressing, and new higher-margin panels (oncology, respiratory)</w:t>
+      </w:r>
+    </w:p>
+    <w:p>
+      <w:pPr>
+        <w:ind w:left="360"/>
+      </w:pPr>
+      <w:r>
+        <w:t>Coris is seasonally loss-making only in H1; H2 HAT-order timing swings it to profit, and full-year FY27 is guided to slight positive EBITDA -- a drag that should ease</w:t>
+      </w:r>
+    </w:p>
+    <w:p/>
+    <w:p>
+      <w:r>
+        <w:rPr>
+          <w:b/>
+        </w:rPr>
+        <w:t>📉 Bear Case:</w:t>
+      </w:r>
+    </w:p>
+    <w:p>
+      <w:pPr>
+        <w:ind w:left="360"/>
+      </w:pPr>
+      <w:r>
+        <w:t>Headline growth is acquisition-inflated: FY26 +47% consolidated vs organic India MDx ~+10%; Q1 FY27 consolidated revenue +50% but PAT -29% YoY -- the organic core has decelerated to mid-teens</w:t>
+      </w:r>
+    </w:p>
+    <w:p>
+      <w:pPr>
+        <w:ind w:left="360"/>
+      </w:pPr>
+      <w:r>
+        <w:t>Coris is currently a drag, not an accretive bolt-on: Q1 FY27 EBITDA -EUR 325K, 'seasonally loss-making in Q1 and Q2', full-year only 'slight positive EBITDA' guided -- it is a turnaround/optionality bet</w:t>
+      </w:r>
+    </w:p>
+    <w:p>
+      <w:pPr>
+        <w:ind w:left="360"/>
+      </w:pPr>
+      <w:r>
+        <w:t>Valuation (~22x P/E, ~3.8x P/B) already reflects the quality and roughly matches the 15-20% guide; little embedded upside unless US FDA / IVDR / Coris deliver, none of which is in FY27 numbers</w:t>
+      </w:r>
+    </w:p>
+    <w:p>
+      <w:pPr>
+        <w:ind w:left="360"/>
+      </w:pPr>
+      <w:r>
+        <w:t>Export growth repeatedly attributed to 'geopolitical headwinds'; promoter holding low at ~41%; operating leverage in the organic core is largely exhausted at ~78% EBITDA margin</w:t>
       </w:r>
     </w:p>
     <w:sectPr>

</xml_diff>